<commit_message>
Update AISC kit to official syllabus: all coding in Python, Exp 5 in SWI-Prolog, update pocket & macro prints
</commit_message>
<xml_diff>
--- a/AISC_ALL_CODES_MACRO_PRINT.docx
+++ b/AISC_ALL_CODES_MACRO_PRINT.docx
@@ -15,12 +15,12 @@
         </w:rPr>
         <w:t>// AISC PRACTICAL EXAM MASTER CODES - READABLE MACRO PRINT</w:t>
         <w:br/>
-        <w:t>// 24CE1045 Aaryan Choube | Batch A/A1 | 7.0 pt Consolas</w:t>
+        <w:t>// 24CE1045 Aaryan Choube | Batch A/A1 | Python (All Exp) &amp; PROLOG (Exp 5)</w:t>
       </w:r>
     </w:p>
     <w:p>
       <w:pPr>
-        <w:spacing w:before="0" w:line="240" w:lineRule="auto" w:after="20"/>
+        <w:spacing w:before="0" w:after="20" w:line="240" w:lineRule="auto"/>
       </w:pPr>
       <w:r>
         <w:rPr>
@@ -29,18 +29,12 @@
           <w:color w:val="B91C1C"/>
           <w:sz w:val="15"/>
         </w:rPr>
-        <w:t>==========================================================</w:t>
-        <w:br/>
-        <w:t>[AISC-02] WaterJugSolver.java (Exp 2)</w:t>
-        <w:br/>
-        <w:t>Complexity: Time: O(C1 * C2) | Space: O(C1 * C2) | Concept: State space BFS graph traversal for measuring 2 gallons</w:t>
-        <w:br/>
-        <w:t>----------------------------------------------------------</w:t>
+        <w:t>// [EXP 2] water_jug.py (Water Jug State Space Search in Python)</w:t>
       </w:r>
     </w:p>
     <w:p>
       <w:pPr>
-        <w:spacing w:before="0" w:line="240" w:lineRule="auto" w:after="60"/>
+        <w:spacing w:before="0" w:after="60" w:line="240" w:lineRule="auto"/>
       </w:pPr>
       <w:r>
         <w:rPr>
@@ -48,187 +42,44 @@
           <w:color w:val="1A202C"/>
           <w:sz w:val="14"/>
         </w:rPr>
-        <w:t>import java.util.*;</w:t>
+        <w:t>from collections import defaultdict</w:t>
+        <w:br/>
+        <w:t>jug1, jug2, aim = 4, 3, 2</w:t>
+        <w:br/>
+        <w:t>visited = defaultdict(lambda: False)</w:t>
         <w:br/>
         <w:br/>
-        <w:t>public class WaterJugSolver {</w:t>
+        <w:t>def waterJugSolver(amt1, amt2):</w:t>
         <w:br/>
-        <w:t xml:space="preserve">  static class State {</w:t>
+        <w:t xml:space="preserve">    if (amt1 == aim and amt2 == 0) or (amt2 == aim and amt1 == 0):</w:t>
         <w:br/>
-        <w:t xml:space="preserve">    int x, y;</w:t>
+        <w:t xml:space="preserve">        print(f"Goal Reached: ({amt1}, {amt2})")</w:t>
         <w:br/>
-        <w:t xml:space="preserve">    List&lt;String&gt; path;</w:t>
+        <w:t xml:space="preserve">        return True</w:t>
+        <w:br/>
+        <w:t xml:space="preserve">    if not visited[(amt1, amt2)]:</w:t>
+        <w:br/>
+        <w:t xml:space="preserve">        print(f"State: ({amt1}, {amt2})")</w:t>
+        <w:br/>
+        <w:t xml:space="preserve">        visited[(amt1, amt2)] = True</w:t>
+        <w:br/>
+        <w:t xml:space="preserve">        return (waterJugSolver(0, amt2) or waterJugSolver(amt1, 0) or</w:t>
+        <w:br/>
+        <w:t xml:space="preserve">                waterJugSolver(jug1, amt2) or waterJugSolver(amt1, jug2) or</w:t>
+        <w:br/>
+        <w:t xml:space="preserve">                waterJugSolver(amt1 + min(amt2, (jug1 - amt1)), amt2 - min(amt2, (jug1 - amt1))) or</w:t>
+        <w:br/>
+        <w:t xml:space="preserve">                waterJugSolver(amt1 - min(amt1, (jug2 - amt2)), amt2 + min(amt1, (jug2 - amt2))))</w:t>
+        <w:br/>
+        <w:t xml:space="preserve">    return False</w:t>
         <w:br/>
         <w:br/>
-        <w:t xml:space="preserve">    State(int x, int y, List&lt;String&gt; path) {</w:t>
-        <w:br/>
-        <w:t xml:space="preserve">      this.x = x;</w:t>
-        <w:br/>
-        <w:t xml:space="preserve">      this.y = y;</w:t>
-        <w:br/>
-        <w:t xml:space="preserve">      this.path = new ArrayList&lt;&gt;(path);</w:t>
-        <w:br/>
-        <w:t xml:space="preserve">      this.path.add("(" + x + ", " + y + ")");</w:t>
-        <w:br/>
-        <w:t xml:space="preserve">    }</w:t>
-        <w:br/>
-        <w:t xml:space="preserve">  }</w:t>
-        <w:br/>
-        <w:br/>
-        <w:t xml:space="preserve">  public static void solveBFS(int jug1, int jug2, int target) {</w:t>
-        <w:br/>
-        <w:t xml:space="preserve">    System.out.println("\nSolving Water Jug Problem using BFS (Shortest Path):");</w:t>
-        <w:br/>
-        <w:t xml:space="preserve">    System.out.println("Jug 1 Capacity: " + jug1 + "L | Jug 2 Capacity: " + jug2 + "L | Target: " + target + "L");</w:t>
-        <w:br/>
-        <w:br/>
-        <w:t xml:space="preserve">    if (target &gt; Math.max(jug1, jug2) || target % gcd(jug1, jug2) != 0) {</w:t>
-        <w:br/>
-        <w:t xml:space="preserve">      System.out.println("Target cannot be measured according to Bezout's identity.");</w:t>
-        <w:br/>
-        <w:t xml:space="preserve">      return;</w:t>
-        <w:br/>
-        <w:t xml:space="preserve">    }</w:t>
-        <w:br/>
-        <w:br/>
-        <w:t xml:space="preserve">    Queue&lt;State&gt; queue = new LinkedList&lt;&gt;();</w:t>
-        <w:br/>
-        <w:t xml:space="preserve">    boolean[][] visited = new boolean[jug1 + 1][jug2 + 1];</w:t>
-        <w:br/>
-        <w:br/>
-        <w:t xml:space="preserve">    queue.add(new State(0, 0, new ArrayList&lt;&gt;()));</w:t>
-        <w:br/>
-        <w:t xml:space="preserve">    visited[0][0] = true;</w:t>
-        <w:br/>
-        <w:br/>
-        <w:t xml:space="preserve">    while (!queue.isEmpty()) {</w:t>
-        <w:br/>
-        <w:t xml:space="preserve">      State current = queue.poll();</w:t>
-        <w:br/>
-        <w:br/>
-        <w:t xml:space="preserve">      if (current.x == target || current.y == target) {</w:t>
-        <w:br/>
-        <w:t xml:space="preserve">        System.out.println("\nGoal State Reached!");</w:t>
-        <w:br/>
-        <w:t xml:space="preserve">        System.out.println("Steps to solution (" + (current.path.size() - 1) + " operations):");</w:t>
-        <w:br/>
-        <w:t xml:space="preserve">        for (int i = 0; i &lt; current.path.size(); i++) {</w:t>
-        <w:br/>
-        <w:t xml:space="preserve">          System.out.println("Step " + i + ": " + current.path.get(i));</w:t>
-        <w:br/>
-        <w:t xml:space="preserve">        }</w:t>
-        <w:br/>
-        <w:t xml:space="preserve">        return;</w:t>
-        <w:br/>
-        <w:t xml:space="preserve">      }</w:t>
-        <w:br/>
-        <w:br/>
-        <w:t xml:space="preserve">      List&lt;int[]&gt; nextStates = new ArrayList&lt;&gt;();</w:t>
-        <w:br/>
-        <w:t xml:space="preserve">      nextStates.add(new int[]{jug1, current.y}); // Fill Jug 1</w:t>
-        <w:br/>
-        <w:t xml:space="preserve">      nextStates.add(new int[]{current.x, jug2}); // Fill Jug 2</w:t>
-        <w:br/>
-        <w:t xml:space="preserve">      nextStates.add(new int[]{0, current.y});    // Empty Jug 1</w:t>
-        <w:br/>
-        <w:t xml:space="preserve">      nextStates.add(new int[]{current.x, 0});    // Empty Jug 2</w:t>
-        <w:br/>
-        <w:br/>
-        <w:t xml:space="preserve">      int pour1to2 = Math.min(current.x, jug2 - current.y);</w:t>
-        <w:br/>
-        <w:t xml:space="preserve">      nextStates.add(new int[]{current.x - pour1to2, current.y + pour1to2});</w:t>
-        <w:br/>
-        <w:br/>
-        <w:t xml:space="preserve">      int pour2to1 = Math.min(current.y, jug1 - current.x);</w:t>
-        <w:br/>
-        <w:t xml:space="preserve">      nextStates.add(new int[]{current.x + pour2to1, current.y - pour2to1});</w:t>
-        <w:br/>
-        <w:br/>
-        <w:t xml:space="preserve">      for (int[] next : nextStates) {</w:t>
-        <w:br/>
-        <w:t xml:space="preserve">        int nx = next[0], ny = next[1];</w:t>
-        <w:br/>
-        <w:t xml:space="preserve">        if (!visited[nx][ny]) {</w:t>
-        <w:br/>
-        <w:t xml:space="preserve">          visited[nx][ny] = true;</w:t>
-        <w:br/>
-        <w:t xml:space="preserve">          queue.add(new State(nx, ny, current.path));</w:t>
-        <w:br/>
-        <w:t xml:space="preserve">        }</w:t>
-        <w:br/>
-        <w:t xml:space="preserve">      }</w:t>
-        <w:br/>
-        <w:t xml:space="preserve">    }</w:t>
-        <w:br/>
-        <w:t xml:space="preserve">    System.out.println("No solution exists.");</w:t>
-        <w:br/>
-        <w:t xml:space="preserve">  }</w:t>
-        <w:br/>
-        <w:br/>
-        <w:t xml:space="preserve">  private static int gcd(int a, int b) {</w:t>
-        <w:br/>
-        <w:t xml:space="preserve">    return b == 0 ? a : gcd(b, a % b);</w:t>
-        <w:br/>
-        <w:t xml:space="preserve">  }</w:t>
-        <w:br/>
-        <w:br/>
-        <w:t xml:space="preserve">  public static void main(String[] args) {</w:t>
-        <w:br/>
-        <w:t xml:space="preserve">    Scanner sc = new Scanner(System.in);</w:t>
-        <w:br/>
-        <w:t xml:space="preserve">    System.out.println("========================================");</w:t>
-        <w:br/>
-        <w:t xml:space="preserve">    System.out.println("   Water Jug Problem Solver (AISC Exp 2)");</w:t>
-        <w:br/>
-        <w:t xml:space="preserve">    System.out.println("========================================");</w:t>
-        <w:br/>
-        <w:t xml:space="preserve">    System.out.println("1. Use default: Jug1 = 4L, Jug2 = 3L, Target = 2L");</w:t>
-        <w:br/>
-        <w:t xml:space="preserve">    System.out.println("2. Enter custom values");</w:t>
-        <w:br/>
-        <w:t xml:space="preserve">    System.out.print("Enter choice (1/2): ");</w:t>
-        <w:br/>
-        <w:br/>
-        <w:t xml:space="preserve">    int choice = 1;</w:t>
-        <w:br/>
-        <w:t xml:space="preserve">    if (sc.hasNextInt()) {</w:t>
-        <w:br/>
-        <w:t xml:space="preserve">      choice = sc.nextInt();</w:t>
-        <w:br/>
-        <w:t xml:space="preserve">    }</w:t>
-        <w:br/>
-        <w:br/>
-        <w:t xml:space="preserve">    int j1 = 4, j2 = 3, target = 2;</w:t>
-        <w:br/>
-        <w:t xml:space="preserve">    if (choice == 2) {</w:t>
-        <w:br/>
-        <w:t xml:space="preserve">      System.out.print("Enter capacity of Jug 1: ");</w:t>
-        <w:br/>
-        <w:t xml:space="preserve">      j1 = sc.nextInt();</w:t>
-        <w:br/>
-        <w:t xml:space="preserve">      System.out.print("Enter capacity of Jug 2: ");</w:t>
-        <w:br/>
-        <w:t xml:space="preserve">      j2 = sc.nextInt();</w:t>
-        <w:br/>
-        <w:t xml:space="preserve">      System.out.print("Enter target amount: ");</w:t>
-        <w:br/>
-        <w:t xml:space="preserve">      target = sc.nextInt();</w:t>
-        <w:br/>
-        <w:t xml:space="preserve">    }</w:t>
-        <w:br/>
-        <w:br/>
-        <w:t xml:space="preserve">    solveBFS(j1, j2, target);</w:t>
-        <w:br/>
-        <w:t xml:space="preserve">    System.out.println("========================================");</w:t>
-        <w:br/>
-        <w:t xml:space="preserve">  }</w:t>
-        <w:br/>
-        <w:t>}</w:t>
+        <w:t>waterJugSolver(0, 0)</w:t>
       </w:r>
     </w:p>
     <w:p>
       <w:pPr>
-        <w:spacing w:before="0" w:line="240" w:lineRule="auto" w:after="20"/>
+        <w:spacing w:before="0" w:after="20" w:line="240" w:lineRule="auto"/>
       </w:pPr>
       <w:r>
         <w:rPr>
@@ -237,18 +88,12 @@
           <w:color w:val="B91C1C"/>
           <w:sz w:val="15"/>
         </w:rPr>
-        <w:t>==========================================================</w:t>
-        <w:br/>
-        <w:t>[AISC-03] TicTacToeMinimax.java (Exp 3)</w:t>
-        <w:br/>
-        <w:t>Complexity: Time: O(b^d) | Space: O(d) | Concept: Adversarial game-tree search for optimal move selection</w:t>
-        <w:br/>
-        <w:t>----------------------------------------------------------</w:t>
+        <w:t>// [EXP 3] tictactoe_minimax.py (Tic-Tac-Toe Minimax Algorithm in Python)</w:t>
       </w:r>
     </w:p>
     <w:p>
       <w:pPr>
-        <w:spacing w:before="0" w:line="240" w:lineRule="auto" w:after="60"/>
+        <w:spacing w:before="0" w:after="60" w:line="240" w:lineRule="auto"/>
       </w:pPr>
       <w:r>
         <w:rPr>
@@ -256,262 +101,69 @@
           <w:color w:val="1A202C"/>
           <w:sz w:val="14"/>
         </w:rPr>
-        <w:t>import java.util.Scanner;</w:t>
+        <w:t>import math</w:t>
         <w:br/>
         <w:br/>
-        <w:t>public class TicTacToeMinimax {</w:t>
+        <w:t>def evaluate(b):</w:t>
         <w:br/>
-        <w:t xml:space="preserve">  static final char HUMAN = 'X';</w:t>
+        <w:t xml:space="preserve">    lines = [[0,1,2],[3,4,5],[6,7,8],[0,3,6],[1,4,7],[2,5,8],[0,4,8],[2,4,6]]</w:t>
         <w:br/>
-        <w:t xml:space="preserve">  static final char AI = 'O';</w:t>
+        <w:t xml:space="preserve">    for x, y, z in lines:</w:t>
         <w:br/>
-        <w:t xml:space="preserve">  static final char EMPTY = ' ';</w:t>
+        <w:t xml:space="preserve">        if b[x] == b[y] == b[z] and b[x] != ' ': return 10 if b[x] == 'X' else -10</w:t>
+        <w:br/>
+        <w:t xml:space="preserve">    return 0</w:t>
         <w:br/>
         <w:br/>
-        <w:t xml:space="preserve">  public static void printBoard(char[][] board) {</w:t>
+        <w:t>def minimax(b, depth, is_max):</w:t>
         <w:br/>
-        <w:t xml:space="preserve">    System.out.println("");</w:t>
+        <w:t xml:space="preserve">    score = evaluate(b)</w:t>
         <w:br/>
-        <w:t xml:space="preserve">    for (int i = 0; i &lt; 3; i++) {</w:t>
+        <w:t xml:space="preserve">    if score != 0 or ' ' not in b: return score</w:t>
         <w:br/>
-        <w:t xml:space="preserve">      System.out.println(" " + board[i][0] + " | " + board[i][1] + " | " + board[i][2]);</w:t>
+        <w:t xml:space="preserve">    if is_max:</w:t>
         <w:br/>
-        <w:t xml:space="preserve">      if (i &lt; 2) System.out.println("---|---|---");</w:t>
+        <w:t xml:space="preserve">        best = -math.inf</w:t>
         <w:br/>
-        <w:t xml:space="preserve">    }</w:t>
+        <w:t xml:space="preserve">        for i in range(9):</w:t>
         <w:br/>
-        <w:t xml:space="preserve">    System.out.println("");</w:t>
+        <w:t xml:space="preserve">            if b[i] == ' ':</w:t>
         <w:br/>
-        <w:t xml:space="preserve">  }</w:t>
+        <w:t xml:space="preserve">                b[i] = 'X'; best = max(best, minimax(b, depth+1, False)); b[i] = ' '</w:t>
+        <w:br/>
+        <w:t xml:space="preserve">        return best</w:t>
+        <w:br/>
+        <w:t xml:space="preserve">    else:</w:t>
+        <w:br/>
+        <w:t xml:space="preserve">        best = math.inf</w:t>
+        <w:br/>
+        <w:t xml:space="preserve">        for i in range(9):</w:t>
+        <w:br/>
+        <w:t xml:space="preserve">            if b[i] == ' ':</w:t>
+        <w:br/>
+        <w:t xml:space="preserve">                b[i] = 'O'; best = min(best, minimax(b, depth+1, True)); b[i] = ' '</w:t>
+        <w:br/>
+        <w:t xml:space="preserve">        return best</w:t>
         <w:br/>
         <w:br/>
-        <w:t xml:space="preserve">  public static boolean isMovesLeft(char[][] board) {</w:t>
+        <w:t>def find_best_move(b):</w:t>
         <w:br/>
-        <w:t xml:space="preserve">    for (int i = 0; i &lt; 3; i++)</w:t>
+        <w:t xml:space="preserve">    best_val, best_move = -math.inf, -1</w:t>
         <w:br/>
-        <w:t xml:space="preserve">      for (int j = 0; j &lt; 3; j++)</w:t>
+        <w:t xml:space="preserve">    for i in range(9):</w:t>
         <w:br/>
-        <w:t xml:space="preserve">        if (board[i][j] == EMPTY) return true;</w:t>
+        <w:t xml:space="preserve">        if b[i] == ' ':</w:t>
         <w:br/>
-        <w:t xml:space="preserve">    return false;</w:t>
+        <w:t xml:space="preserve">            b[i] = 'X'; val = minimax(b, 0, False); b[i] = ' '</w:t>
         <w:br/>
-        <w:t xml:space="preserve">  }</w:t>
+        <w:t xml:space="preserve">            if val &gt; best_val: best_val, best_move = val, i</w:t>
         <w:br/>
-        <w:br/>
-        <w:t xml:space="preserve">  public static int evaluate(char[][] b) {</w:t>
-        <w:br/>
-        <w:t xml:space="preserve">    for (int row = 0; row &lt; 3; row++) {</w:t>
-        <w:br/>
-        <w:t xml:space="preserve">      if (b[row][0] == b[row][1] &amp;&amp; b[row][1] == b[row][2]) {</w:t>
-        <w:br/>
-        <w:t xml:space="preserve">        if (b[row][0] == AI) return +10;</w:t>
-        <w:br/>
-        <w:t xml:space="preserve">        else if (b[row][0] == HUMAN) return -10;</w:t>
-        <w:br/>
-        <w:t xml:space="preserve">      }</w:t>
-        <w:br/>
-        <w:t xml:space="preserve">    }</w:t>
-        <w:br/>
-        <w:t xml:space="preserve">    for (int col = 0; col &lt; 3; col++) {</w:t>
-        <w:br/>
-        <w:t xml:space="preserve">      if (b[0][col] == b[1][col] &amp;&amp; b[1][col] == b[2][col]) {</w:t>
-        <w:br/>
-        <w:t xml:space="preserve">        if (b[0][col] == AI) return +10;</w:t>
-        <w:br/>
-        <w:t xml:space="preserve">        else if (b[0][col] == HUMAN) return -10;</w:t>
-        <w:br/>
-        <w:t xml:space="preserve">      }</w:t>
-        <w:br/>
-        <w:t xml:space="preserve">    }</w:t>
-        <w:br/>
-        <w:t xml:space="preserve">    if (b[0][0] == b[1][1] &amp;&amp; b[1][1] == b[2][2]) {</w:t>
-        <w:br/>
-        <w:t xml:space="preserve">      if (b[0][0] == AI) return +10;</w:t>
-        <w:br/>
-        <w:t xml:space="preserve">      else if (b[0][0] == HUMAN) return -10;</w:t>
-        <w:br/>
-        <w:t xml:space="preserve">    }</w:t>
-        <w:br/>
-        <w:t xml:space="preserve">    if (b[0][2] == b[1][1] &amp;&amp; b[1][1] == b[2][0]) {</w:t>
-        <w:br/>
-        <w:t xml:space="preserve">      if (b[0][2] == AI) return +10;</w:t>
-        <w:br/>
-        <w:t xml:space="preserve">      else if (b[0][2] == HUMAN) return -10;</w:t>
-        <w:br/>
-        <w:t xml:space="preserve">    }</w:t>
-        <w:br/>
-        <w:t xml:space="preserve">    return 0;</w:t>
-        <w:br/>
-        <w:t xml:space="preserve">  }</w:t>
-        <w:br/>
-        <w:br/>
-        <w:t xml:space="preserve">  public static int minimax(char[][] board, int depth, boolean isMax) {</w:t>
-        <w:br/>
-        <w:t xml:space="preserve">    int score = evaluate(board);</w:t>
-        <w:br/>
-        <w:t xml:space="preserve">    if (score == 10) return score - depth;</w:t>
-        <w:br/>
-        <w:t xml:space="preserve">    if (score == -10) return score + depth;</w:t>
-        <w:br/>
-        <w:t xml:space="preserve">    if (!isMovesLeft(board)) return 0;</w:t>
-        <w:br/>
-        <w:br/>
-        <w:t xml:space="preserve">    if (isMax) {</w:t>
-        <w:br/>
-        <w:t xml:space="preserve">      int best = -1000;</w:t>
-        <w:br/>
-        <w:t xml:space="preserve">      for (int i = 0; i &lt; 3; i++) {</w:t>
-        <w:br/>
-        <w:t xml:space="preserve">        for (int j = 0; j &lt; 3; j++) {</w:t>
-        <w:br/>
-        <w:t xml:space="preserve">          if (board[i][j] == EMPTY) {</w:t>
-        <w:br/>
-        <w:t xml:space="preserve">            board[i][j] = AI;</w:t>
-        <w:br/>
-        <w:t xml:space="preserve">            best = Math.max(best, minimax(board, depth + 1, false));</w:t>
-        <w:br/>
-        <w:t xml:space="preserve">            board[i][j] = EMPTY;</w:t>
-        <w:br/>
-        <w:t xml:space="preserve">          }</w:t>
-        <w:br/>
-        <w:t xml:space="preserve">        }</w:t>
-        <w:br/>
-        <w:t xml:space="preserve">      }</w:t>
-        <w:br/>
-        <w:t xml:space="preserve">      return best;</w:t>
-        <w:br/>
-        <w:t xml:space="preserve">    } else {</w:t>
-        <w:br/>
-        <w:t xml:space="preserve">      int best = 1000;</w:t>
-        <w:br/>
-        <w:t xml:space="preserve">      for (int i = 0; i &lt; 3; i++) {</w:t>
-        <w:br/>
-        <w:t xml:space="preserve">        for (int j = 0; j &lt; 3; j++) {</w:t>
-        <w:br/>
-        <w:t xml:space="preserve">          if (board[i][j] == EMPTY) {</w:t>
-        <w:br/>
-        <w:t xml:space="preserve">            board[i][j] = HUMAN;</w:t>
-        <w:br/>
-        <w:t xml:space="preserve">            best = Math.min(best, minimax(board, depth + 1, true));</w:t>
-        <w:br/>
-        <w:t xml:space="preserve">            board[i][j] = EMPTY;</w:t>
-        <w:br/>
-        <w:t xml:space="preserve">          }</w:t>
-        <w:br/>
-        <w:t xml:space="preserve">        }</w:t>
-        <w:br/>
-        <w:t xml:space="preserve">      }</w:t>
-        <w:br/>
-        <w:t xml:space="preserve">      return best;</w:t>
-        <w:br/>
-        <w:t xml:space="preserve">    }</w:t>
-        <w:br/>
-        <w:t xml:space="preserve">  }</w:t>
-        <w:br/>
-        <w:br/>
-        <w:t xml:space="preserve">  public static int[] findBestMove(char[][] board) {</w:t>
-        <w:br/>
-        <w:t xml:space="preserve">    int bestVal = -1000;</w:t>
-        <w:br/>
-        <w:t xml:space="preserve">    int[] bestMove = {-1, -1};</w:t>
-        <w:br/>
-        <w:t xml:space="preserve">    for (int i = 0; i &lt; 3; i++) {</w:t>
-        <w:br/>
-        <w:t xml:space="preserve">      for (int j = 0; j &lt; 3; j++) {</w:t>
-        <w:br/>
-        <w:t xml:space="preserve">        if (board[i][j] == EMPTY) {</w:t>
-        <w:br/>
-        <w:t xml:space="preserve">          board[i][j] = AI;</w:t>
-        <w:br/>
-        <w:t xml:space="preserve">          int moveVal = minimax(board, 0, false);</w:t>
-        <w:br/>
-        <w:t xml:space="preserve">          board[i][j] = EMPTY;</w:t>
-        <w:br/>
-        <w:t xml:space="preserve">          if (moveVal &gt; bestVal) {</w:t>
-        <w:br/>
-        <w:t xml:space="preserve">            bestMove[0] = i;</w:t>
-        <w:br/>
-        <w:t xml:space="preserve">            bestMove[1] = j;</w:t>
-        <w:br/>
-        <w:t xml:space="preserve">            bestVal = moveVal;</w:t>
-        <w:br/>
-        <w:t xml:space="preserve">          }</w:t>
-        <w:br/>
-        <w:t xml:space="preserve">        }</w:t>
-        <w:br/>
-        <w:t xml:space="preserve">      }</w:t>
-        <w:br/>
-        <w:t xml:space="preserve">    }</w:t>
-        <w:br/>
-        <w:t xml:space="preserve">    return bestMove;</w:t>
-        <w:br/>
-        <w:t xml:space="preserve">  }</w:t>
-        <w:br/>
-        <w:br/>
-        <w:t xml:space="preserve">  public static void main(String[] args) {</w:t>
-        <w:br/>
-        <w:t xml:space="preserve">    Scanner sc = new Scanner(System.in);</w:t>
-        <w:br/>
-        <w:t xml:space="preserve">    System.out.println("========================================");</w:t>
-        <w:br/>
-        <w:t xml:space="preserve">    System.out.println("  Tic-Tac-Toe Minimax Agent (AISC Exp 3)");</w:t>
-        <w:br/>
-        <w:t xml:space="preserve">    System.out.println("========================================");</w:t>
-        <w:br/>
-        <w:t xml:space="preserve">    System.out.println("You are 'X' and AI is 'O'. Position numbers 1 to 9:");</w:t>
-        <w:br/>
-        <w:t xml:space="preserve">    System.out.println(" 1 | 2 | 3 ");</w:t>
-        <w:br/>
-        <w:t xml:space="preserve">    System.out.println("---|---|---");</w:t>
-        <w:br/>
-        <w:t xml:space="preserve">    System.out.println(" 4 | 5 | 6 ");</w:t>
-        <w:br/>
-        <w:t xml:space="preserve">    System.out.println("---|---|---");</w:t>
-        <w:br/>
-        <w:t xml:space="preserve">    System.out.println(" 7 | 8 | 9 ");</w:t>
-        <w:br/>
-        <w:br/>
-        <w:t xml:space="preserve">    char[][] board = {</w:t>
-        <w:br/>
-        <w:t xml:space="preserve">      {' ', ' ', ' '},</w:t>
-        <w:br/>
-        <w:t xml:space="preserve">      {' ', ' ', ' '},</w:t>
-        <w:br/>
-        <w:t xml:space="preserve">      {' ', ' ', ' '}</w:t>
-        <w:br/>
-        <w:t xml:space="preserve">    };</w:t>
-        <w:br/>
-        <w:br/>
-        <w:t xml:space="preserve">    System.out.println("\nAI calculating optimal response if Human plays center (pos 5):");</w:t>
-        <w:br/>
-        <w:t xml:space="preserve">    board[1][1] = HUMAN;</w:t>
-        <w:br/>
-        <w:t xml:space="preserve">    printBoard(board);</w:t>
-        <w:br/>
-        <w:br/>
-        <w:t xml:space="preserve">    int[] aiMove = findBestMove(board);</w:t>
-        <w:br/>
-        <w:t xml:space="preserve">    System.out.println("Minimax AI selects row " + aiMove[0] + ", col " + aiMove[1] + " (Optimal Corner response)");</w:t>
-        <w:br/>
-        <w:t xml:space="preserve">    board[aiMove[0]][aiMove[1]] = AI;</w:t>
-        <w:br/>
-        <w:t xml:space="preserve">    printBoard(board);</w:t>
-        <w:br/>
-        <w:br/>
-        <w:t xml:space="preserve">    System.out.println("Strategy: Minimax Decision Tree (Adversarial Search)");</w:t>
-        <w:br/>
-        <w:t xml:space="preserve">    System.out.println("Result: AI is theoretically unbeatable (always wins or draws).");</w:t>
-        <w:br/>
-        <w:t xml:space="preserve">    System.out.println("========================================");</w:t>
-        <w:br/>
-        <w:t xml:space="preserve">  }</w:t>
-        <w:br/>
-        <w:t>}</w:t>
+        <w:t xml:space="preserve">    return best_move</w:t>
       </w:r>
     </w:p>
     <w:p>
       <w:pPr>
-        <w:spacing w:before="0" w:line="240" w:lineRule="auto" w:after="20"/>
+        <w:spacing w:before="0" w:after="20" w:line="240" w:lineRule="auto"/>
       </w:pPr>
       <w:r>
         <w:rPr>
@@ -520,18 +172,12 @@
           <w:color w:val="B91C1C"/>
           <w:sz w:val="15"/>
         </w:rPr>
-        <w:t>==========================================================</w:t>
-        <w:br/>
-        <w:t>[AISC-05] AStarSearch.java (Exp 5)</w:t>
-        <w:br/>
-        <w:t>Complexity: Time: O(b^d) | Space: O(b^d) | Concept: Informed heuristic graph search evaluating f(n) = g(n) + h(n)</w:t>
-        <w:br/>
-        <w:t>----------------------------------------------------------</w:t>
+        <w:t>// [EXP 4] astar_search.py (Informed A* Search Algorithm in Python)</w:t>
       </w:r>
     </w:p>
     <w:p>
       <w:pPr>
-        <w:spacing w:before="0" w:line="240" w:lineRule="auto" w:after="60"/>
+        <w:spacing w:before="0" w:after="60" w:line="240" w:lineRule="auto"/>
       </w:pPr>
       <w:r>
         <w:rPr>
@@ -539,203 +185,50 @@
           <w:color w:val="1A202C"/>
           <w:sz w:val="14"/>
         </w:rPr>
-        <w:t>import java.util.*;</w:t>
+        <w:t>class Graph:</w:t>
         <w:br/>
+        <w:t xml:space="preserve">    def __init__(self, adj, h):</w:t>
         <w:br/>
-        <w:t>public class AStarSearch {</w:t>
+        <w:t xml:space="preserve">        self.adj, self.h = adj, h</w:t>
         <w:br/>
-        <w:t xml:space="preserve">  static class Node implements Comparable&lt;Node&gt; {</w:t>
+        <w:t xml:space="preserve">    def a_star(self, start, stop):</w:t>
         <w:br/>
-        <w:t xml:space="preserve">    int id;</w:t>
+        <w:t xml:space="preserve">        open_set, closed_set = {start}, set()</w:t>
         <w:br/>
-        <w:t xml:space="preserve">    int g;</w:t>
+        <w:t xml:space="preserve">        g, parents = {start: 0}, {start: start}</w:t>
         <w:br/>
-        <w:t xml:space="preserve">    int h;</w:t>
+        <w:t xml:space="preserve">        while open_set:</w:t>
         <w:br/>
-        <w:t xml:space="preserve">    int f;</w:t>
+        <w:t xml:space="preserve">            n = min(open_set, key=lambda v: g[v] + self.h.get(v, float('inf')))</w:t>
         <w:br/>
-        <w:t xml:space="preserve">    Node parent;</w:t>
+        <w:t xml:space="preserve">            if n == stop:</w:t>
         <w:br/>
+        <w:t xml:space="preserve">                path = []</w:t>
         <w:br/>
-        <w:t xml:space="preserve">    Node(int id, int g, int h, Node parent) {</w:t>
+        <w:t xml:space="preserve">                while parents[n] != n: path.append(n); n = parents[n]</w:t>
         <w:br/>
-        <w:t xml:space="preserve">      this.id = id;</w:t>
+        <w:t xml:space="preserve">                path.append(start); path.reverse(); return path</w:t>
         <w:br/>
-        <w:t xml:space="preserve">      this.g = g;</w:t>
+        <w:t xml:space="preserve">            open_set.remove(n); closed_set.add(n)</w:t>
         <w:br/>
-        <w:t xml:space="preserve">      this.h = h;</w:t>
+        <w:t xml:space="preserve">            for m, weight in self.adj.get(n, []):</w:t>
         <w:br/>
-        <w:t xml:space="preserve">      this.f = g + h;</w:t>
+        <w:t xml:space="preserve">                if m in closed_set: continue</w:t>
         <w:br/>
-        <w:t xml:space="preserve">      this.parent = parent;</w:t>
+        <w:t xml:space="preserve">                if m not in open_set: open_set.add(m)</w:t>
         <w:br/>
-        <w:t xml:space="preserve">    }</w:t>
+        <w:t xml:space="preserve">                tentative_g = g[n] + weight</w:t>
         <w:br/>
+        <w:t xml:space="preserve">                if tentative_g &lt; g.get(m, float('inf')):</w:t>
         <w:br/>
-        <w:t xml:space="preserve">    public int compareTo(Node o) {</w:t>
+        <w:t xml:space="preserve">                    g[m], parents[m] = tentative_g, n</w:t>
         <w:br/>
-        <w:t xml:space="preserve">      return Integer.compare(this.f, o.f);</w:t>
-        <w:br/>
-        <w:t xml:space="preserve">    }</w:t>
-        <w:br/>
-        <w:t xml:space="preserve">  }</w:t>
-        <w:br/>
-        <w:br/>
-        <w:t xml:space="preserve">  static class Edge {</w:t>
-        <w:br/>
-        <w:t xml:space="preserve">    int target, weight;</w:t>
-        <w:br/>
-        <w:t xml:space="preserve">    Edge(int target, int weight) {</w:t>
-        <w:br/>
-        <w:t xml:space="preserve">      this.target = target;</w:t>
-        <w:br/>
-        <w:t xml:space="preserve">      this.weight = weight;</w:t>
-        <w:br/>
-        <w:t xml:space="preserve">    }</w:t>
-        <w:br/>
-        <w:t xml:space="preserve">  }</w:t>
-        <w:br/>
-        <w:br/>
-        <w:t xml:space="preserve">  public static void runAStar(Map&lt;Integer, List&lt;Edge&gt;&gt; graph, int[] heuristics, int start, int goal) {</w:t>
-        <w:br/>
-        <w:t xml:space="preserve">    PriorityQueue&lt;Node&gt; openList = new PriorityQueue&lt;&gt;();</w:t>
-        <w:br/>
-        <w:t xml:space="preserve">    Map&lt;Integer, Integer&gt; bestG = new HashMap&lt;&gt;();</w:t>
-        <w:br/>
-        <w:br/>
-        <w:t xml:space="preserve">    openList.add(new Node(start, 0, heuristics[start], null));</w:t>
-        <w:br/>
-        <w:t xml:space="preserve">    bestG.put(start, 0);</w:t>
-        <w:br/>
-        <w:br/>
-        <w:t xml:space="preserve">    System.out.println("\n--- A* Search Node Expansion ---");</w:t>
-        <w:br/>
-        <w:t xml:space="preserve">    System.out.println("Node\tg(n)\th(n)\tf(n)");</w:t>
-        <w:br/>
-        <w:br/>
-        <w:t xml:space="preserve">    while (!openList.isEmpty()) {</w:t>
-        <w:br/>
-        <w:t xml:space="preserve">      Node current = openList.poll();</w:t>
-        <w:br/>
-        <w:t xml:space="preserve">      System.out.printf("N%d\t%d\t%d\t%d\n", current.id, current.g, current.h, current.f);</w:t>
-        <w:br/>
-        <w:br/>
-        <w:t xml:space="preserve">      if (current.id == goal) {</w:t>
-        <w:br/>
-        <w:t xml:space="preserve">        System.out.println("\nGoal Node " + goal + " reached with optimal cost: " + current.g);</w:t>
-        <w:br/>
-        <w:t xml:space="preserve">        printPath(current);</w:t>
-        <w:br/>
-        <w:t xml:space="preserve">        return;</w:t>
-        <w:br/>
-        <w:t xml:space="preserve">      }</w:t>
-        <w:br/>
-        <w:br/>
-        <w:t xml:space="preserve">      for (Edge edge : graph.getOrDefault(current.id, Collections.emptyList())) {</w:t>
-        <w:br/>
-        <w:t xml:space="preserve">        int newG = current.g + edge.weight;</w:t>
-        <w:br/>
-        <w:t xml:space="preserve">        int neighbor = edge.target;</w:t>
-        <w:br/>
-        <w:br/>
-        <w:t xml:space="preserve">        if (!bestG.containsKey(neighbor) || newG &lt; bestG.get(neighbor)) {</w:t>
-        <w:br/>
-        <w:t xml:space="preserve">          bestG.put(neighbor, newG);</w:t>
-        <w:br/>
-        <w:t xml:space="preserve">          openList.add(new Node(neighbor, newG, heuristics[neighbor], current));</w:t>
-        <w:br/>
-        <w:t xml:space="preserve">        }</w:t>
-        <w:br/>
-        <w:t xml:space="preserve">      }</w:t>
-        <w:br/>
-        <w:t xml:space="preserve">    }</w:t>
-        <w:br/>
-        <w:t xml:space="preserve">    System.out.println("Goal node is unreachable.");</w:t>
-        <w:br/>
-        <w:t xml:space="preserve">  }</w:t>
-        <w:br/>
-        <w:br/>
-        <w:t xml:space="preserve">  private static void printPath(Node goalNode) {</w:t>
-        <w:br/>
-        <w:t xml:space="preserve">    List&lt;Integer&gt; path = new ArrayList&lt;&gt;();</w:t>
-        <w:br/>
-        <w:t xml:space="preserve">    Node curr = goalNode;</w:t>
-        <w:br/>
-        <w:t xml:space="preserve">    while (curr != null) {</w:t>
-        <w:br/>
-        <w:t xml:space="preserve">      path.add(curr.id);</w:t>
-        <w:br/>
-        <w:t xml:space="preserve">      curr = curr.parent;</w:t>
-        <w:br/>
-        <w:t xml:space="preserve">    }</w:t>
-        <w:br/>
-        <w:t xml:space="preserve">    Collections.reverse(path);</w:t>
-        <w:br/>
-        <w:t xml:space="preserve">    System.out.print("Optimal Path: ");</w:t>
-        <w:br/>
-        <w:t xml:space="preserve">    for (int i = 0; i &lt; path.size(); i++) {</w:t>
-        <w:br/>
-        <w:t xml:space="preserve">      System.out.print("N" + path.get(i) + (i &lt; path.size() - 1 ? " -&gt; " : ""));</w:t>
-        <w:br/>
-        <w:t xml:space="preserve">    }</w:t>
-        <w:br/>
-        <w:t xml:space="preserve">    System.out.println();</w:t>
-        <w:br/>
-        <w:t xml:space="preserve">  }</w:t>
-        <w:br/>
-        <w:br/>
-        <w:t xml:space="preserve">  public static void main(String[] args) {</w:t>
-        <w:br/>
-        <w:t xml:space="preserve">    System.out.println("========================================");</w:t>
-        <w:br/>
-        <w:t xml:space="preserve">    System.out.println("      A* Search Algorithm (AISC Exp 4)");</w:t>
-        <w:br/>
-        <w:t xml:space="preserve">    System.out.println("========================================");</w:t>
-        <w:br/>
-        <w:br/>
-        <w:t xml:space="preserve">    int[] heuristics = {10, 8, 5, 7, 3, 0};</w:t>
-        <w:br/>
-        <w:t xml:space="preserve">    Map&lt;Integer, List&lt;Edge&gt;&gt; graph = new HashMap&lt;&gt;();</w:t>
-        <w:br/>
-        <w:t xml:space="preserve">    for (int i = 0; i &lt; 6; i++) graph.put(i, new ArrayList&lt;&gt;());</w:t>
-        <w:br/>
-        <w:br/>
-        <w:t xml:space="preserve">    graph.get(0).add(new Edge(1, 2));</w:t>
-        <w:br/>
-        <w:t xml:space="preserve">    graph.get(0).add(new Edge(2, 4));</w:t>
-        <w:br/>
-        <w:t xml:space="preserve">    graph.get(1).add(new Edge(3, 7));</w:t>
-        <w:br/>
-        <w:t xml:space="preserve">    graph.get(1).add(new Edge(4, 3));</w:t>
-        <w:br/>
-        <w:t xml:space="preserve">    graph.get(2).add(new Edge(4, 1));</w:t>
-        <w:br/>
-        <w:t xml:space="preserve">    graph.get(3).add(new Edge(5, 5));</w:t>
-        <w:br/>
-        <w:t xml:space="preserve">    graph.get(4).add(new Edge(5, 4));</w:t>
-        <w:br/>
-        <w:br/>
-        <w:t xml:space="preserve">    System.out.println("Graph configured with Start = N0, Goal = N5");</w:t>
-        <w:br/>
-        <w:t xml:space="preserve">    System.out.println("Heuristics h(n): N0=10, N1=8, N2=5, N3=7, N4=3, N5=0");</w:t>
-        <w:br/>
-        <w:br/>
-        <w:t xml:space="preserve">    runAStar(graph, heuristics, 0, 5);</w:t>
-        <w:br/>
-        <w:t xml:space="preserve">    System.out.println("Evaluation Function: f(n) = g(n) + h(n)");</w:t>
-        <w:br/>
-        <w:t xml:space="preserve">    System.out.println("Optimality: A* is optimal if heuristic h(n) is admissible (never overestimates).");</w:t>
-        <w:br/>
-        <w:t xml:space="preserve">    System.out.println("========================================");</w:t>
-        <w:br/>
-        <w:t xml:space="preserve">  }</w:t>
-        <w:br/>
-        <w:t>}</w:t>
+        <w:t xml:space="preserve">        return None</w:t>
       </w:r>
     </w:p>
     <w:p>
       <w:pPr>
-        <w:spacing w:before="0" w:line="240" w:lineRule="auto" w:after="20"/>
+        <w:spacing w:before="0" w:after="20" w:line="240" w:lineRule="auto"/>
       </w:pPr>
       <w:r>
         <w:rPr>
@@ -744,18 +237,12 @@
           <w:color w:val="B91C1C"/>
           <w:sz w:val="15"/>
         </w:rPr>
-        <w:t>==========================================================</w:t>
-        <w:br/>
-        <w:t>[AISC-06] FuzzyOperations.java (Exp 6)</w:t>
-        <w:br/>
-        <w:t>Complexity: Time: O(n) | Space: O(n) | Concept: Fuzzy set theory: Union (max), Intersection (min), Complement (1-mu)</w:t>
-        <w:br/>
-        <w:t>----------------------------------------------------------</w:t>
+        <w:t>// [EXP 5] prolog_programs.pl (SWI-Prolog Logic Programs - Weather, Family, Temp)</w:t>
       </w:r>
     </w:p>
     <w:p>
       <w:pPr>
-        <w:spacing w:before="0" w:line="240" w:lineRule="auto" w:after="60"/>
+        <w:spacing w:before="0" w:after="60" w:line="240" w:lineRule="auto"/>
       </w:pPr>
       <w:r>
         <w:rPr>
@@ -763,157 +250,36 @@
           <w:color w:val="1A202C"/>
           <w:sz w:val="14"/>
         </w:rPr>
-        <w:t>import java.util.Scanner;</w:t>
+        <w:t>% Weather Rules</w:t>
+        <w:br/>
+        <w:t>weather(phoenix, summer, hot). weather(la, summer, warm). weather(phoenix, winter, warm).</w:t>
+        <w:br/>
+        <w:t>warmer_than(C1, C2) :- weather(C1, summer, hot), weather(C2, summer, warm).</w:t>
         <w:br/>
         <w:br/>
-        <w:t>public class FuzzyOperations {</w:t>
+        <w:t>% Family Tree</w:t>
         <w:br/>
-        <w:t xml:space="preserve">  public static void printSet(String name, double[] set) {</w:t>
+        <w:t>parent(joe, jane). parent(harry, carl). parent(meg, jane).</w:t>
         <w:br/>
-        <w:t xml:space="preserve">    System.out.print(name + " = { ");</w:t>
+        <w:t>parent(jane, anne). parent(carl, ralph). parent(hazel, harry).</w:t>
         <w:br/>
-        <w:t xml:space="preserve">    for (int i = 0; i &lt; set.length; i++) {</w:t>
+        <w:t>grandparent(X, Z) :- parent(X, Y), parent(Y, Z).</w:t>
         <w:br/>
-        <w:t xml:space="preserve">      System.out.printf("%.2f/x%d", set[i], (i + 1));</w:t>
+        <w:t>ancestor(X, Y) :- parent(X, Y).</w:t>
         <w:br/>
-        <w:t xml:space="preserve">      if (i &lt; set.length - 1) System.out.print(", ");</w:t>
-        <w:br/>
-        <w:t xml:space="preserve">    }</w:t>
-        <w:br/>
-        <w:t xml:space="preserve">    System.out.println(" }");</w:t>
-        <w:br/>
-        <w:t xml:space="preserve">  }</w:t>
+        <w:t>ancestor(X, Y) :- parent(X, Z), ancestor(Z, Y).</w:t>
         <w:br/>
         <w:br/>
-        <w:t xml:space="preserve">  public static void main(String[] args) {</w:t>
+        <w:t>% Temperature Conversion</w:t>
         <w:br/>
-        <w:t xml:space="preserve">    System.out.println("========================================");</w:t>
+        <w:t>centigrade_to_fahrenheit(C, F) :- F is (C * 9 / 5) + 32.</w:t>
         <w:br/>
-        <w:t xml:space="preserve">    System.out.println("      Fuzzy Set Operations (AISC Exp 8)");</w:t>
-        <w:br/>
-        <w:t xml:space="preserve">    System.out.println("========================================");</w:t>
-        <w:br/>
-        <w:br/>
-        <w:t xml:space="preserve">    double[] A = {0.2, 0.5, 0.8, 1.0};</w:t>
-        <w:br/>
-        <w:t xml:space="preserve">    double[] B = {0.6, 0.4, 0.7, 0.1};</w:t>
-        <w:br/>
-        <w:br/>
-        <w:t xml:space="preserve">    printSet("Fuzzy Set A", A);</w:t>
-        <w:br/>
-        <w:t xml:space="preserve">    printSet("Fuzzy Set B", B);</w:t>
-        <w:br/>
-        <w:br/>
-        <w:t xml:space="preserve">    int n = A.length;</w:t>
-        <w:br/>
-        <w:t xml:space="preserve">    double[] union = new double[n];</w:t>
-        <w:br/>
-        <w:t xml:space="preserve">    double[] intersection = new double[n];</w:t>
-        <w:br/>
-        <w:t xml:space="preserve">    double[] compA = new double[n];</w:t>
-        <w:br/>
-        <w:t xml:space="preserve">    double[] compB = new double[n];</w:t>
-        <w:br/>
-        <w:t xml:space="preserve">    double[] diffAB = new double[n];</w:t>
-        <w:br/>
-        <w:br/>
-        <w:t xml:space="preserve">    for (int i = 0; i &lt; n; i++) {</w:t>
-        <w:br/>
-        <w:t xml:space="preserve">      union[i] = Math.max(A[i], B[i]);</w:t>
-        <w:br/>
-        <w:t xml:space="preserve">      intersection[i] = Math.min(A[i], B[i]);</w:t>
-        <w:br/>
-        <w:t xml:space="preserve">      compA[i] = 1.0 - A[i];</w:t>
-        <w:br/>
-        <w:t xml:space="preserve">      compB[i] = 1.0 - B[i];</w:t>
-        <w:br/>
-        <w:t xml:space="preserve">      diffAB[i] = Math.min(A[i], 1.0 - B[i]);</w:t>
-        <w:br/>
-        <w:t xml:space="preserve">    }</w:t>
-        <w:br/>
-        <w:br/>
-        <w:t xml:space="preserve">    System.out.println("\n--- Standard Fuzzy Operations ---");</w:t>
-        <w:br/>
-        <w:t xml:space="preserve">    printSet("Union (A ∪ B)        [max]", union);</w:t>
-        <w:br/>
-        <w:t xml:space="preserve">    printSet("Intersection (A ∩ B) [min]", intersection);</w:t>
-        <w:br/>
-        <w:t xml:space="preserve">    printSet("Complement (A')      [1 - A]", compA);</w:t>
-        <w:br/>
-        <w:t xml:space="preserve">    printSet("Difference (A - B)   [A ∩ B']", diffAB);</w:t>
-        <w:br/>
-        <w:br/>
-        <w:t xml:space="preserve">    System.out.println("\n--- Cartesian Product (A × B) ---");</w:t>
-        <w:br/>
-        <w:t xml:space="preserve">    double[][] cartesian = new double[n][n];</w:t>
-        <w:br/>
-        <w:t xml:space="preserve">    for (int i = 0; i &lt; n; i++) {</w:t>
-        <w:br/>
-        <w:t xml:space="preserve">      for (int j = 0; j &lt; n; j++) {</w:t>
-        <w:br/>
-        <w:t xml:space="preserve">        cartesian[i][j] = Math.min(A[i], B[j]);</w:t>
-        <w:br/>
-        <w:t xml:space="preserve">        System.out.printf("%.2f\t", cartesian[i][j]);</w:t>
-        <w:br/>
-        <w:t xml:space="preserve">      }</w:t>
-        <w:br/>
-        <w:t xml:space="preserve">      System.out.println();</w:t>
-        <w:br/>
-        <w:t xml:space="preserve">    }</w:t>
-        <w:br/>
-        <w:br/>
-        <w:t xml:space="preserve">    System.out.println("\n--- Max-Min Composition Demo ---");</w:t>
-        <w:br/>
-        <w:t xml:space="preserve">    double[][] R = {{0.3, 0.7}, {0.8, 0.4}};</w:t>
-        <w:br/>
-        <w:t xml:space="preserve">    double[][] S = {{0.5, 0.9}, {0.6, 0.2}};</w:t>
-        <w:br/>
-        <w:t xml:space="preserve">    double[][] T = new double[2][2];</w:t>
-        <w:br/>
-        <w:br/>
-        <w:t xml:space="preserve">    for (int i = 0; i &lt; 2; i++) {</w:t>
-        <w:br/>
-        <w:t xml:space="preserve">      for (int j = 0; j &lt; 2; j++) {</w:t>
-        <w:br/>
-        <w:t xml:space="preserve">        double maxVal = 0.0;</w:t>
-        <w:br/>
-        <w:t xml:space="preserve">        for (int k = 0; k &lt; 2; k++) {</w:t>
-        <w:br/>
-        <w:t xml:space="preserve">          maxVal = Math.max(maxVal, Math.min(R[i][k], S[k][j]));</w:t>
-        <w:br/>
-        <w:t xml:space="preserve">        }</w:t>
-        <w:br/>
-        <w:t xml:space="preserve">        T[i][j] = maxVal;</w:t>
-        <w:br/>
-        <w:t xml:space="preserve">      }</w:t>
-        <w:br/>
-        <w:t xml:space="preserve">    }</w:t>
-        <w:br/>
-        <w:br/>
-        <w:t xml:space="preserve">    System.out.println("Composition Matrix T = R ∘ S:");</w:t>
-        <w:br/>
-        <w:t xml:space="preserve">    for (int i = 0; i &lt; 2; i++) {</w:t>
-        <w:br/>
-        <w:t xml:space="preserve">      for (int j = 0; j &lt; 2; j++) {</w:t>
-        <w:br/>
-        <w:t xml:space="preserve">        System.out.printf("%.2f\t", T[i][j]);</w:t>
-        <w:br/>
-        <w:t xml:space="preserve">      }</w:t>
-        <w:br/>
-        <w:t xml:space="preserve">      System.out.println();</w:t>
-        <w:br/>
-        <w:t xml:space="preserve">    }</w:t>
-        <w:br/>
-        <w:t xml:space="preserve">    System.out.println("========================================");</w:t>
-        <w:br/>
-        <w:t xml:space="preserve">  }</w:t>
-        <w:br/>
-        <w:t>}</w:t>
+        <w:t>is_below_freezing(C) :- C &lt; 0.</w:t>
       </w:r>
     </w:p>
     <w:p>
       <w:pPr>
-        <w:spacing w:before="0" w:line="240" w:lineRule="auto" w:after="20"/>
+        <w:spacing w:before="0" w:after="20" w:line="240" w:lineRule="auto"/>
       </w:pPr>
       <w:r>
         <w:rPr>
@@ -922,18 +288,12 @@
           <w:color w:val="B91C1C"/>
           <w:sz w:val="15"/>
         </w:rPr>
-        <w:t>==========================================================</w:t>
-        <w:br/>
-        <w:t>[AISC-10] Perceptron.java (Exp 10)</w:t>
-        <w:br/>
-        <w:t>Complexity: Time: O(Epochs * N) | Space: O(Features) | Concept: Single-layer artificial neural network binary classification</w:t>
-        <w:br/>
-        <w:t>----------------------------------------------------------</w:t>
+        <w:t>// [EXP 6] perceptron_slp_mlp.py (Single-Layer &amp; Multilayer Perceptron in Python)</w:t>
       </w:r>
     </w:p>
     <w:p>
       <w:pPr>
-        <w:spacing w:before="0" w:line="240" w:lineRule="auto" w:after="60"/>
+        <w:spacing w:before="0" w:after="60" w:line="240" w:lineRule="auto"/>
       </w:pPr>
       <w:r>
         <w:rPr>
@@ -941,122 +301,199 @@
           <w:color w:val="1A202C"/>
           <w:sz w:val="14"/>
         </w:rPr>
-        <w:t>import java.util.Scanner;</w:t>
+        <w:t>from sklearn.datasets import load_breast_cancer</w:t>
+        <w:br/>
+        <w:t>from sklearn.model_selection import train_test_split</w:t>
+        <w:br/>
+        <w:t>from sklearn.preprocessing import StandardScaler</w:t>
+        <w:br/>
+        <w:t>from sklearn.linear_model import Perceptron</w:t>
+        <w:br/>
+        <w:t>from sklearn.neural_network import MLPClassifier</w:t>
+        <w:br/>
+        <w:t>from sklearn.metrics import accuracy_score</w:t>
         <w:br/>
         <w:br/>
-        <w:t>public class Perceptron {</w:t>
+        <w:t>X, y = load_breast_cancer(return_X_y=True)</w:t>
         <w:br/>
-        <w:t xml:space="preserve">  public static void trainPerceptron(int[][] inputs, int[] targets, String gateName) {</w:t>
+        <w:t>X_train, X_test, y_train, y_test = train_test_split(X, y, test_size=0.2, random_state=42)</w:t>
         <w:br/>
-        <w:t xml:space="preserve">    double[] weights = {0.0, 0.0};</w:t>
+        <w:t>scaler = StandardScaler()</w:t>
         <w:br/>
-        <w:t xml:space="preserve">    double bias = 0.0;</w:t>
+        <w:t>X_train = scaler.fit_transform(X_train)</w:t>
         <w:br/>
-        <w:t xml:space="preserve">    double lr = 0.1;</w:t>
-        <w:br/>
-        <w:t xml:space="preserve">    int epochs = 10;</w:t>
+        <w:t>X_test = scaler.transform(X_test)</w:t>
         <w:br/>
         <w:br/>
-        <w:t xml:space="preserve">    System.out.println("\n--- Training Perceptron for " + gateName + " Gate ---");</w:t>
+        <w:t>slp = Perceptron(max_iter=1000, random_state=42).fit(X_train, y_train)</w:t>
         <w:br/>
-        <w:t xml:space="preserve">    System.out.println("Learning Rate: " + lr);</w:t>
+        <w:t>print("SLP Accuracy:", accuracy_score(y_test, slp.predict(X_test)))</w:t>
         <w:br/>
         <w:br/>
-        <w:t xml:space="preserve">    for (int epoch = 1; epoch &lt;= epochs; epoch++) {</w:t>
+        <w:t>mlp = MLPClassifier(hidden_layer_sizes=(64, 32), max_iter=500, random_state=42).fit(X_train, y_train)</w:t>
         <w:br/>
-        <w:t xml:space="preserve">      int totalError = 0;</w:t>
+        <w:t>print("MLP Accuracy:", accuracy_score(y_test, mlp.predict(X_test)))</w:t>
+      </w:r>
+    </w:p>
+    <w:p>
+      <w:pPr>
+        <w:spacing w:before="0" w:after="20" w:line="240" w:lineRule="auto"/>
+      </w:pPr>
+      <w:r>
+        <w:rPr>
+          <w:rFonts w:ascii="Consolas" w:hAnsi="Consolas"/>
+          <w:b/>
+          <w:color w:val="B91C1C"/>
+          <w:sz w:val="15"/>
+        </w:rPr>
+        <w:t>// [EXP 7] mcculloch_pitts.py (McCulloch-Pitts Neuron Model for Logic Gates)</w:t>
+      </w:r>
+    </w:p>
+    <w:p>
+      <w:pPr>
+        <w:spacing w:before="0" w:after="60" w:line="240" w:lineRule="auto"/>
+      </w:pPr>
+      <w:r>
+        <w:rPr>
+          <w:rFonts w:ascii="Consolas" w:hAnsi="Consolas"/>
+          <w:color w:val="1A202C"/>
+          <w:sz w:val="14"/>
+        </w:rPr>
+        <w:t>def mcculloch_pitts(inputs, weights, threshold):</w:t>
         <w:br/>
-        <w:t xml:space="preserve">      for (int i = 0; i &lt; inputs.length; i++) {</w:t>
+        <w:t xml:space="preserve">    net = sum(x * w for x, w in zip(inputs, weights))</w:t>
         <w:br/>
-        <w:t xml:space="preserve">        double net = inputs[i][0] * weights[0] + inputs[i][1] * weights[1] + bias;</w:t>
-        <w:br/>
-        <w:t xml:space="preserve">        int output = (net &gt;= 0) ? 1 : 0;</w:t>
-        <w:br/>
-        <w:t xml:space="preserve">        int error = targets[i] - output;</w:t>
-        <w:br/>
-        <w:t xml:space="preserve">        totalError += Math.abs(error);</w:t>
+        <w:t xml:space="preserve">    return 1 if net &gt;= threshold else 0</w:t>
         <w:br/>
         <w:br/>
-        <w:t xml:space="preserve">        weights[0] += lr * error * inputs[i][0];</w:t>
+        <w:t># AND Gate (weights=[1, 1], threshold=2)</w:t>
         <w:br/>
-        <w:t xml:space="preserve">        weights[1] += lr * error * inputs[i][1];</w:t>
+        <w:t># OR Gate  (weights=[1, 1], threshold=1)</w:t>
         <w:br/>
-        <w:t xml:space="preserve">        bias += lr * error;</w:t>
+        <w:t># NOT Gate (weight=[-1],    threshold=0)</w:t>
         <w:br/>
-        <w:t xml:space="preserve">      }</w:t>
+        <w:t>print("AND(1, 1) =", mcculloch_pitts([1, 1], [1, 1], 2))</w:t>
+        <w:br/>
+        <w:t>print("OR(0, 1)  =", mcculloch_pitts([0, 1], [1, 1], 1))</w:t>
+        <w:br/>
+        <w:t>print("NOT(1)    =", mcculloch_pitts([1], [-1], 0))</w:t>
+      </w:r>
+    </w:p>
+    <w:p>
+      <w:pPr>
+        <w:spacing w:before="0" w:after="20" w:line="240" w:lineRule="auto"/>
+      </w:pPr>
+      <w:r>
+        <w:rPr>
+          <w:rFonts w:ascii="Consolas" w:hAnsi="Consolas"/>
+          <w:b/>
+          <w:color w:val="B91C1C"/>
+          <w:sz w:val="15"/>
+        </w:rPr>
+        <w:t>// [EXP 8] fuzzy_operations.py (Fuzzy Set Operations &amp; Relations in Python / NumPy)</w:t>
+      </w:r>
+    </w:p>
+    <w:p>
+      <w:pPr>
+        <w:spacing w:before="0" w:after="60" w:line="240" w:lineRule="auto"/>
+      </w:pPr>
+      <w:r>
+        <w:rPr>
+          <w:rFonts w:ascii="Consolas" w:hAnsi="Consolas"/>
+          <w:color w:val="1A202C"/>
+          <w:sz w:val="14"/>
+        </w:rPr>
+        <w:t>import numpy as np</w:t>
         <w:br/>
         <w:br/>
-        <w:t xml:space="preserve">      if (totalError == 0) {</w:t>
+        <w:t>A = np.array([0.2, 0.5, 0.8, 1.0])</w:t>
         <w:br/>
-        <w:t xml:space="preserve">        System.out.println("Converged at Epoch " + epoch + "!");</w:t>
-        <w:br/>
-        <w:t xml:space="preserve">        break;</w:t>
-        <w:br/>
-        <w:t xml:space="preserve">      }</w:t>
-        <w:br/>
-        <w:t xml:space="preserve">    }</w:t>
+        <w:t>B = np.array([0.3, 0.7, 0.6, 0.4])</w:t>
         <w:br/>
         <w:br/>
-        <w:t xml:space="preserve">    System.out.printf("Final Weights: w1 = %.2f, w2 = %.2f, bias = %.2f\n", weights[0], weights[1], bias);</w:t>
+        <w:t>union = np.maximum(A, B)</w:t>
         <w:br/>
-        <w:t xml:space="preserve">    System.out.println("Verification Table:");</w:t>
+        <w:t>intersection = np.minimum(A, B)</w:t>
         <w:br/>
-        <w:t xml:space="preserve">    System.out.println("x1\tx2\tTarget\tPredicted\tStatus");</w:t>
+        <w:t>comp_A = 1 - A</w:t>
         <w:br/>
-        <w:t xml:space="preserve">    for (int i = 0; i &lt; inputs.length; i++) {</w:t>
-        <w:br/>
-        <w:t xml:space="preserve">      double net = inputs[i][0] * weights[0] + inputs[i][1] * weights[1] + bias;</w:t>
-        <w:br/>
-        <w:t xml:space="preserve">      int pred = (net &gt;= 0) ? 1 : 0;</w:t>
-        <w:br/>
-        <w:t xml:space="preserve">      System.out.println(inputs[i][0] + "\t" + inputs[i][1] + "\t" + targets[i] + "\t" + pred + "\t\t" + (pred == targets[i] ? "MATCH" : "FAIL"));</w:t>
-        <w:br/>
-        <w:t xml:space="preserve">    }</w:t>
-        <w:br/>
-        <w:t xml:space="preserve">  }</w:t>
+        <w:t>diff_AB = np.minimum(A, 1 - B)</w:t>
         <w:br/>
         <w:br/>
-        <w:t xml:space="preserve">  public static void main(String[] args) {</w:t>
+        <w:t># Cartesian Product R = A x B</w:t>
         <w:br/>
-        <w:t xml:space="preserve">    System.out.println("========================================");</w:t>
-        <w:br/>
-        <w:t xml:space="preserve">    System.out.println("   Single-Layer Perceptron (AISC Exp 6)");</w:t>
-        <w:br/>
-        <w:t xml:space="preserve">    System.out.println("========================================");</w:t>
+        <w:t>R = np.minimum.outer(A, B)</w:t>
         <w:br/>
         <w:br/>
-        <w:t xml:space="preserve">    int[][] inputs = {</w:t>
+        <w:t># Max-Min Composition T = R o S</w:t>
         <w:br/>
-        <w:t xml:space="preserve">      {0, 0},</w:t>
+        <w:t>S = np.array([[0.8, 0.4], [0.6, 0.7], [0.5, 0.9], [0.3, 0.8]])</w:t>
         <w:br/>
-        <w:t xml:space="preserve">      {0, 1},</w:t>
+        <w:t>T = np.zeros((R.shape[0], S.shape[1]))</w:t>
         <w:br/>
-        <w:t xml:space="preserve">      {1, 0},</w:t>
+        <w:t>for i in range(R.shape[0]):</w:t>
         <w:br/>
-        <w:t xml:space="preserve">      {1, 1}</w:t>
+        <w:t xml:space="preserve">    for j in range(S.shape[1]):</w:t>
         <w:br/>
-        <w:t xml:space="preserve">    };</w:t>
+        <w:t xml:space="preserve">        T[i, j] = max(min(R[i, k], S[k, j]) for k in range(R.shape[1]))</w:t>
         <w:br/>
         <w:br/>
-        <w:t xml:space="preserve">    int[] andTargets = {0, 0, 0, 1};</w:t>
+        <w:t>print("Union:", union, "\nIntersection:", intersection)</w:t>
         <w:br/>
-        <w:t xml:space="preserve">    int[] orTargets = {0, 1, 1, 1};</w:t>
+        <w:t>print("Cartesian Product R:\n", R, "\nMax-Min Composition T:\n", T)</w:t>
+      </w:r>
+    </w:p>
+    <w:p>
+      <w:pPr>
+        <w:spacing w:before="0" w:after="20" w:line="240" w:lineRule="auto"/>
+      </w:pPr>
+      <w:r>
+        <w:rPr>
+          <w:rFonts w:ascii="Consolas" w:hAnsi="Consolas"/>
+          <w:b/>
+          <w:color w:val="B91C1C"/>
+          <w:sz w:val="15"/>
+        </w:rPr>
+        <w:t>// [EXP 9] text_cleaning_udf.py (Text Preprocessing &amp; Cleaning UDF for Generative AI)</w:t>
+      </w:r>
+    </w:p>
+    <w:p>
+      <w:pPr>
+        <w:spacing w:before="0" w:after="60" w:line="240" w:lineRule="auto"/>
+      </w:pPr>
+      <w:r>
+        <w:rPr>
+          <w:rFonts w:ascii="Consolas" w:hAnsi="Consolas"/>
+          <w:color w:val="1A202C"/>
+          <w:sz w:val="14"/>
+        </w:rPr>
+        <w:t>import re, string</w:t>
         <w:br/>
         <w:br/>
-        <w:t xml:space="preserve">    trainPerceptron(inputs, andTargets, "AND");</w:t>
+        <w:t>def clean_text(text):</w:t>
         <w:br/>
-        <w:t xml:space="preserve">    trainPerceptron(inputs, orTargets, "OR");</w:t>
+        <w:t xml:space="preserve">    text = str(text).lower()</w:t>
+        <w:br/>
+        <w:t xml:space="preserve">    text = re.sub(r'http\S+|www\S+', '', text)</w:t>
+        <w:br/>
+        <w:t xml:space="preserve">    text = re.sub(r'&lt;.*?&gt;', '', text)</w:t>
+        <w:br/>
+        <w:t xml:space="preserve">    text = text.translate(str.maketrans('', '', string.punctuation))</w:t>
+        <w:br/>
+        <w:t xml:space="preserve">    text = re.sub(r'\d+', '', text)</w:t>
+        <w:br/>
+        <w:t xml:space="preserve">    return re.sub(r'\s+', ' ', text).strip()</w:t>
         <w:br/>
         <w:br/>
-        <w:t xml:space="preserve">    System.out.println("\nNote: SLP can solve linearly separable problems (AND, OR).");</w:t>
+        <w:t>sample = "&lt;p&gt;Welcome to AISC Lab 2026! Visit http://ai.org &amp; learn AI &amp; NLP.&lt;/p&gt;"</w:t>
         <w:br/>
-        <w:t xml:space="preserve">    System.out.println("XOR is non-linearly separable and requires Multi-Layer Perceptron (MLP).");</w:t>
+        <w:t>cleaned = clean_text(sample)</w:t>
         <w:br/>
-        <w:t xml:space="preserve">    System.out.println("========================================");</w:t>
+        <w:t>tokens = cleaned.split()</w:t>
         <w:br/>
-        <w:t xml:space="preserve">  }</w:t>
+        <w:t>print("Cleaned:", cleaned)</w:t>
         <w:br/>
-        <w:t>}</w:t>
+        <w:t>print("Tokens :", tokens)</w:t>
       </w:r>
     </w:p>
     <w:sectPr>

</xml_diff>